<commit_message>
ZENA letter: Scott's two wording changes
'they pay you for' becomes 'they look for services from you'. The original put
the transaction at the front of a sentence about patient trust.

'or hours of unmetered sunlight' becomes 'versus'. The 'or' read as an
alternative being offered rather than a comparison being drawn, which is why
Scott had to read it several times.

Co-Authored-By: Claude Opus 5 <noreply@anthropic.com>
</commit_message>
<xml_diff>
--- a/Enyrgy_Letter_ZENA_Medical.docx
+++ b/Enyrgy_Letter_ZENA_Medical.docx
@@ -98,7 +98,7 @@
         <w:pStyle w:val="FirstParagraph"/>
       </w:pPr>
       <w:r>
-        <w:t xml:space="preserve">Your patients avoid the sun. The ones who follow your guidance most faithfully avoid it hardest, because for them it is not health advice, it is the entire maintenance plan behind everything else they pay you for.</w:t>
+        <w:t xml:space="preserve">Your patients avoid the sun. The ones who follow your guidance most faithfully avoid it hardest, because for them it is not health advice, it is the entire maintenance plan behind everything else they look for services from you.</w:t>
       </w:r>
     </w:p>
     <w:p>
@@ -212,7 +212,7 @@
         <w:pStyle w:val="BodyText"/>
       </w:pPr>
       <w:r>
-        <w:t xml:space="preserve">So the comparison is not ultraviolet against no ultraviolet. For the same vitamin D outcome, it is a small capped mostly-UVB exposure, or hours of unmetered sunlight that is overwhelmingly UVA. Your patients are already choosing between those. Most are choosing neither, and taking a capsule that may not be working.</w:t>
+        <w:t xml:space="preserve">So the comparison is not ultraviolet against no ultraviolet. For the same vitamin D outcome, it is a small capped mostly-UVB exposure, versus hours of unmetered sunlight that is overwhelmingly UVA. Your patients are already choosing between those. Most are choosing neither, and taking a capsule that may not be working.</w:t>
       </w:r>
     </w:p>
     <w:p>

</xml_diff>